<commit_message>
minor change to test jekyll
minor change
</commit_message>
<xml_diff>
--- a/img/format.docx
+++ b/img/format.docx
@@ -92,16 +92,7 @@
           <w:sz w:val="22"/>
           <w:szCs w:val="22"/>
         </w:rPr>
-        <w:t>mail-id</w:t>
-      </w:r>
-      <w:r>
-        <w:rPr>
-          <w:rFonts w:eastAsia="Baskerville" w:ascii="Baskerville" w:hAnsi="Baskerville"/>
-          <w:color w:val="000000"/>
-          <w:sz w:val="22"/>
-          <w:szCs w:val="22"/>
-        </w:rPr>
-        <w:t>@</w:t>
+        <w:t>mail-id@</w:t>
       </w:r>
       <w:r>
         <w:rPr>
@@ -353,7 +344,7 @@
           <w:sz w:val="22"/>
           <w:szCs w:val="22"/>
         </w:rPr>
-        <w:t xml:space="preserve">! Cras justo odio, dapibus ac facilisis in, egestas eget quam. Cum sociis natoque penatibus et magnis dis parturient montes, nascetur ridiculus mus. Vivamus sagittis lacus vel augue laoreet rutrum faucibus dolor auctor. Maecenas faucibus mollis interdum. </w:t>
+        <w:t xml:space="preserve">! Cras justo odio, dapibus ac facilisis in, egestas eget quam. Cum sociis natoque penatibus et magnis dis parturient montes, nascetur ridiculus mus. Vivamus sagitis lacus vel augue laoreet rutrum faucibus dolor auctor. Maecenas faucibus mollis interdum. </w:t>
       </w:r>
     </w:p>
     <w:p>
@@ -536,23 +527,7 @@
           <w:sz w:val="22"/>
           <w:szCs w:val="22"/>
         </w:rPr>
-        <w:t xml:space="preserve">Try not to have headers right at the bottom </w:t>
-      </w:r>
-      <w:r>
-        <w:rPr>
-          <w:rFonts w:eastAsia="Baskerville" w:ascii="Baskerville" w:hAnsi="Baskerville"/>
-          <w:sz w:val="22"/>
-          <w:szCs w:val="22"/>
-        </w:rPr>
-        <w:t>of</w:t>
-      </w:r>
-      <w:r>
-        <w:rPr>
-          <w:rFonts w:eastAsia="Baskerville" w:ascii="Baskerville" w:hAnsi="Baskerville"/>
-          <w:sz w:val="22"/>
-          <w:szCs w:val="22"/>
-        </w:rPr>
-        <w:t xml:space="preserve"> a page, it’s better just to move it down a couple of lines to keep it with the text. I will be dealing with the following theories, ideas and terminology. This is where my ideas came from and this is what other academics have said about them. </w:t>
+        <w:t xml:space="preserve">Try not to have headers right at the bottom of a page, it’s better just to move it down a couple of lines to keep it with the text. I will be dealing with the following theories, ideas and terminology. This is where my ideas came from and this is what other academics have said about them. </w:t>
       </w:r>
     </w:p>
     <w:p>
@@ -732,17 +707,7 @@
           <w:sz w:val="24"/>
           <w:szCs w:val="24"/>
         </w:rPr>
-        <w:t>3.1 Theory A</w:t>
-      </w:r>
-      <w:r>
-        <w:rPr>
-          <w:rFonts w:eastAsia="Baskerville" w:ascii="Baskerville" w:hAnsi="Baskerville"/>
-          <w:b/>
-          <w:bCs/>
-          <w:sz w:val="24"/>
-          <w:szCs w:val="24"/>
-        </w:rPr>
-        <w:t xml:space="preserve"> </w:t>
+        <w:t xml:space="preserve">3.1 Theory A </w:t>
       </w:r>
       <w:r>
         <w:rPr>
@@ -985,16 +950,7 @@
           <w:iCs/>
           <w:color w:val="B2B2B2"/>
         </w:rPr>
-        <w:t xml:space="preserve"> (</w:t>
-      </w:r>
-      <w:r>
-        <w:rPr>
-          <w:rFonts w:eastAsia="Baskerville" w:ascii="Baskerville" w:hAnsi="Baskerville"/>
-          <w:i/>
-          <w:iCs/>
-          <w:color w:val="B2B2B2"/>
-        </w:rPr>
-        <w:t xml:space="preserve">Sub-sub-section 3.3.1 – </w:t>
+        <w:t xml:space="preserve"> (Sub-sub-section 3.3.1 – </w:t>
       </w:r>
       <w:r>
         <w:rPr>
@@ -1104,23 +1060,7 @@
           <w:sz w:val="22"/>
           <w:szCs w:val="22"/>
         </w:rPr>
-        <w:t xml:space="preserve">Based on my understanding of theory I chose the following things (people, newspapers, groups of people, countries, tv shows etc) to study. From this population of ‘things’ I took a sample. This </w:t>
-      </w:r>
-      <w:r>
-        <w:rPr>
-          <w:rFonts w:eastAsia="Baskerville" w:ascii="Baskerville" w:hAnsi="Baskerville"/>
-          <w:sz w:val="22"/>
-          <w:szCs w:val="22"/>
-        </w:rPr>
-        <w:t xml:space="preserve">is </w:t>
-      </w:r>
-      <w:r>
-        <w:rPr>
-          <w:rFonts w:eastAsia="Baskerville" w:ascii="Baskerville" w:hAnsi="Baskerville"/>
-          <w:sz w:val="22"/>
-          <w:szCs w:val="22"/>
-        </w:rPr>
-        <w:t>the sample I took, this is why it's the right sample and this is how it helps me answer my question. Furthermore as Bryson(1991, p34) points out;</w:t>
+        <w:t>Based on my understanding of theory I chose the following things (people, newspapers, groups of people, countries, tv shows etc) to study. From this population of ‘things’ I took a sample. This is the sample I took, this is why it's the right sample and this is how it helps me answer my question. Furthermore as Bryson(1991, p34) points out;</w:t>
       </w:r>
     </w:p>
     <w:p>
@@ -1252,7 +1192,7 @@
                 <wp:positionV relativeFrom="paragraph">
                   <wp:posOffset>107950</wp:posOffset>
                 </wp:positionV>
-                <wp:extent cx="3601720" cy="2346325"/>
+                <wp:extent cx="3602355" cy="2346960"/>
                 <wp:effectExtent l="0" t="0" r="0" b="0"/>
                 <wp:wrapTopAndBottom/>
                 <wp:docPr id="1" name="Frame1"/>
@@ -1263,7 +1203,7 @@
                       <wps:spPr>
                         <a:xfrm>
                           <a:off x="0" y="0"/>
-                          <a:ext cx="3601080" cy="2345760"/>
+                          <a:ext cx="3601800" cy="2346480"/>
                         </a:xfrm>
                         <a:prstGeom prst="rect">
                           <a:avLst/>
@@ -1338,7 +1278,7 @@
                           </w:p>
                         </w:txbxContent>
                       </wps:txbx>
-                      <wps:bodyPr lIns="0" rIns="0" tIns="0" bIns="0">
+                      <wps:bodyPr lIns="0" rIns="0" tIns="0" bIns="0" anchor="t">
                         <a:noAutofit/>
                       </wps:bodyPr>
                     </wps:wsp>
@@ -1349,7 +1289,7 @@
           </mc:Choice>
           <mc:Fallback>
             <w:pict>
-              <v:rect id="shape_0" ID="Frame1" path="m0,0l-2147483645,0l-2147483645,-2147483646l0,-2147483646xe" stroked="f" style="position:absolute;margin-left:85.1pt;margin-top:8.5pt;width:283.5pt;height:184.65pt;mso-wrap-style:square;v-text-anchor:top" wp14:anchorId="37B53445">
+              <v:rect id="shape_0" ID="Frame1" path="m0,0l-2147483645,0l-2147483645,-2147483646l0,-2147483646xe" stroked="f" o:allowincell="f" style="position:absolute;margin-left:85.1pt;margin-top:8.5pt;width:283.55pt;height:184.7pt;mso-wrap-style:square;v-text-anchor:top" wp14:anchorId="37B53445">
                 <v:fill o:detectmouseclick="t" on="false"/>
                 <v:stroke color="#3465a4" joinstyle="round" endcap="flat"/>
                 <v:textbox>
@@ -1388,7 +1328,7 @@
                                     </pic:cNvPicPr>
                                   </pic:nvPicPr>
                                   <pic:blipFill>
-                                    <a:blip r:embed="rId2"/>
+                                    <a:blip r:embed="rId3"/>
                                     <a:stretch>
                                       <a:fillRect/>
                                     </a:stretch>
@@ -1481,8 +1421,8 @@
       </w:tblPr>
       <w:tblGrid>
         <w:gridCol w:w="2337"/>
-        <w:gridCol w:w="1623"/>
-        <w:gridCol w:w="1542"/>
+        <w:gridCol w:w="1622"/>
+        <w:gridCol w:w="1543"/>
       </w:tblGrid>
       <w:tr>
         <w:trPr/>
@@ -1523,7 +1463,7 @@
         </w:tc>
         <w:tc>
           <w:tcPr>
-            <w:tcW w:w="1623" w:type="dxa"/>
+            <w:tcW w:w="1622" w:type="dxa"/>
             <w:tcBorders>
               <w:top w:val="single" w:sz="2" w:space="0" w:color="000000"/>
               <w:bottom w:val="single" w:sz="2" w:space="0" w:color="000000"/>
@@ -1568,7 +1508,7 @@
         </w:tc>
         <w:tc>
           <w:tcPr>
-            <w:tcW w:w="1542" w:type="dxa"/>
+            <w:tcW w:w="1543" w:type="dxa"/>
             <w:tcBorders>
               <w:top w:val="single" w:sz="2" w:space="0" w:color="000000"/>
               <w:bottom w:val="single" w:sz="2" w:space="0" w:color="000000"/>
@@ -1633,7 +1573,7 @@
         </w:tc>
         <w:tc>
           <w:tcPr>
-            <w:tcW w:w="1623" w:type="dxa"/>
+            <w:tcW w:w="1622" w:type="dxa"/>
             <w:tcBorders/>
             <w:shd w:color="auto" w:fill="auto" w:val="clear"/>
           </w:tcPr>
@@ -1660,7 +1600,7 @@
         </w:tc>
         <w:tc>
           <w:tcPr>
-            <w:tcW w:w="1542" w:type="dxa"/>
+            <w:tcW w:w="1543" w:type="dxa"/>
             <w:tcBorders/>
             <w:shd w:color="auto" w:fill="auto" w:val="clear"/>
           </w:tcPr>
@@ -1727,7 +1667,7 @@
         </w:tc>
         <w:tc>
           <w:tcPr>
-            <w:tcW w:w="1623" w:type="dxa"/>
+            <w:tcW w:w="1622" w:type="dxa"/>
             <w:tcBorders>
               <w:bottom w:val="single" w:sz="4" w:space="0" w:color="000000"/>
             </w:tcBorders>
@@ -1756,7 +1696,7 @@
         </w:tc>
         <w:tc>
           <w:tcPr>
-            <w:tcW w:w="1542" w:type="dxa"/>
+            <w:tcW w:w="1543" w:type="dxa"/>
             <w:tcBorders>
               <w:bottom w:val="single" w:sz="4" w:space="0" w:color="000000"/>
             </w:tcBorders>
@@ -1934,79 +1874,7 @@
           <w:sz w:val="22"/>
           <w:szCs w:val="22"/>
         </w:rPr>
-        <w:t xml:space="preserve">Abed, F. (1991). Cultural </w:t>
-      </w:r>
-      <w:r>
-        <w:rPr>
-          <w:rFonts w:eastAsia="Baskerville" w:ascii="Baskerville" w:hAnsi="Baskerville"/>
-          <w:color w:val="000000"/>
-          <w:sz w:val="22"/>
-          <w:szCs w:val="22"/>
-        </w:rPr>
-        <w:t>i</w:t>
-      </w:r>
-      <w:r>
-        <w:rPr>
-          <w:rFonts w:eastAsia="Baskerville" w:ascii="Baskerville" w:hAnsi="Baskerville"/>
-          <w:color w:val="000000"/>
-          <w:sz w:val="22"/>
-          <w:szCs w:val="22"/>
-        </w:rPr>
-        <w:t xml:space="preserve">nfluences on </w:t>
-      </w:r>
-      <w:r>
-        <w:rPr>
-          <w:rFonts w:eastAsia="Baskerville" w:ascii="Baskerville" w:hAnsi="Baskerville"/>
-          <w:color w:val="000000"/>
-          <w:sz w:val="22"/>
-          <w:szCs w:val="22"/>
-        </w:rPr>
-        <w:t>v</w:t>
-      </w:r>
-      <w:r>
-        <w:rPr>
-          <w:rFonts w:eastAsia="Baskerville" w:ascii="Baskerville" w:hAnsi="Baskerville"/>
-          <w:color w:val="000000"/>
-          <w:sz w:val="22"/>
-          <w:szCs w:val="22"/>
-        </w:rPr>
-        <w:t xml:space="preserve">isual </w:t>
-      </w:r>
-      <w:r>
-        <w:rPr>
-          <w:rFonts w:eastAsia="Baskerville" w:ascii="Baskerville" w:hAnsi="Baskerville"/>
-          <w:color w:val="000000"/>
-          <w:sz w:val="22"/>
-          <w:szCs w:val="22"/>
-        </w:rPr>
-        <w:t>s</w:t>
-      </w:r>
-      <w:r>
-        <w:rPr>
-          <w:rFonts w:eastAsia="Baskerville" w:ascii="Baskerville" w:hAnsi="Baskerville"/>
-          <w:color w:val="000000"/>
-          <w:sz w:val="22"/>
-          <w:szCs w:val="22"/>
-        </w:rPr>
-        <w:t xml:space="preserve">canning </w:t>
-      </w:r>
-      <w:r>
-        <w:rPr>
-          <w:rFonts w:eastAsia="Baskerville" w:ascii="Baskerville" w:hAnsi="Baskerville"/>
-          <w:color w:val="000000"/>
-          <w:sz w:val="22"/>
-          <w:szCs w:val="22"/>
-        </w:rPr>
-        <w:t>p</w:t>
-      </w:r>
-      <w:r>
-        <w:rPr>
-          <w:rFonts w:eastAsia="Baskerville" w:ascii="Baskerville" w:hAnsi="Baskerville"/>
-          <w:color w:val="000000"/>
-          <w:sz w:val="22"/>
-          <w:szCs w:val="22"/>
-        </w:rPr>
-        <w:t xml:space="preserve">atterns. </w:t>
+        <w:t xml:space="preserve">Abed, F. (1991). Cultural influences on visual scanning patterns. </w:t>
       </w:r>
       <w:r>
         <w:rPr>
@@ -2073,29 +1941,7 @@
           <w:sz w:val="22"/>
           <w:szCs w:val="22"/>
         </w:rPr>
-        <w:t xml:space="preserve">Meiji, 1868: </w:t>
-      </w:r>
-      <w:r>
-        <w:rPr>
-          <w:rFonts w:eastAsia="Baskerville" w:ascii="Baskerville" w:hAnsi="Baskerville"/>
-          <w:i/>
-          <w:iCs/>
-          <w:color w:val="000000"/>
-          <w:sz w:val="22"/>
-          <w:szCs w:val="22"/>
-        </w:rPr>
-        <w:t>R</w:t>
-      </w:r>
-      <w:r>
-        <w:rPr>
-          <w:rFonts w:eastAsia="Baskerville" w:ascii="Baskerville" w:hAnsi="Baskerville"/>
-          <w:i/>
-          <w:iCs/>
-          <w:color w:val="000000"/>
-          <w:sz w:val="22"/>
-          <w:szCs w:val="22"/>
-        </w:rPr>
-        <w:t>evolution and counter-revolution in Japan</w:t>
+        <w:t>Meiji, 1868: Revolution and counter-revolution in Japan</w:t>
       </w:r>
       <w:r>
         <w:rPr>
@@ -2207,51 +2053,7 @@
           <w:sz w:val="22"/>
           <w:szCs w:val="22"/>
         </w:rPr>
-        <w:t xml:space="preserve">Visual </w:t>
-      </w:r>
-      <w:r>
-        <w:rPr>
-          <w:rFonts w:eastAsia="Baskerville" w:ascii="Baskerville" w:hAnsi="Baskerville"/>
-          <w:i/>
-          <w:iCs/>
-          <w:color w:val="000000"/>
-          <w:sz w:val="22"/>
-          <w:szCs w:val="22"/>
-        </w:rPr>
-        <w:t>t</w:t>
-      </w:r>
-      <w:r>
-        <w:rPr>
-          <w:rFonts w:eastAsia="Baskerville" w:ascii="Baskerville" w:hAnsi="Baskerville"/>
-          <w:i/>
-          <w:iCs/>
-          <w:color w:val="000000"/>
-          <w:sz w:val="22"/>
-          <w:szCs w:val="22"/>
-        </w:rPr>
-        <w:t xml:space="preserve">heory: Painting and </w:t>
-      </w:r>
-      <w:r>
-        <w:rPr>
-          <w:rFonts w:eastAsia="Baskerville" w:ascii="Baskerville" w:hAnsi="Baskerville"/>
-          <w:i/>
-          <w:iCs/>
-          <w:color w:val="000000"/>
-          <w:sz w:val="22"/>
-          <w:szCs w:val="22"/>
-        </w:rPr>
-        <w:t>i</w:t>
-      </w:r>
-      <w:r>
-        <w:rPr>
-          <w:rFonts w:eastAsia="Baskerville" w:ascii="Baskerville" w:hAnsi="Baskerville"/>
-          <w:i/>
-          <w:iCs/>
-          <w:color w:val="000000"/>
-          <w:sz w:val="22"/>
-          <w:szCs w:val="22"/>
-        </w:rPr>
-        <w:t>nterpretation. Polity</w:t>
+        <w:t>Visual theory: Painting and interpretation. Polity</w:t>
       </w:r>
       <w:r>
         <w:rPr>
@@ -2296,61 +2098,7 @@
           <w:sz w:val="22"/>
           <w:szCs w:val="22"/>
         </w:rPr>
-        <w:t xml:space="preserve">Furukawa, T. (1999). ‘Shimbun </w:t>
-      </w:r>
-      <w:r>
-        <w:rPr>
-          <w:rFonts w:eastAsia="Baskerville" w:ascii="Baskerville" w:hAnsi="Baskerville"/>
-          <w:color w:val="000000"/>
-          <w:sz w:val="22"/>
-          <w:szCs w:val="22"/>
-        </w:rPr>
-        <w:t>k</w:t>
-      </w:r>
-      <w:r>
-        <w:rPr>
-          <w:rFonts w:eastAsia="Baskerville" w:ascii="Baskerville" w:hAnsi="Baskerville"/>
-          <w:color w:val="000000"/>
-          <w:sz w:val="22"/>
-          <w:szCs w:val="22"/>
-        </w:rPr>
-        <w:t xml:space="preserve">isha’ </w:t>
-      </w:r>
-      <w:r>
-        <w:rPr>
-          <w:rFonts w:eastAsia="Baskerville" w:ascii="Baskerville" w:hAnsi="Baskerville"/>
-          <w:color w:val="000000"/>
-          <w:sz w:val="22"/>
-          <w:szCs w:val="22"/>
-        </w:rPr>
-        <w:t>s</w:t>
-      </w:r>
-      <w:r>
-        <w:rPr>
-          <w:rFonts w:eastAsia="Baskerville" w:ascii="Baskerville" w:hAnsi="Baskerville"/>
-          <w:color w:val="000000"/>
-          <w:sz w:val="22"/>
-          <w:szCs w:val="22"/>
-        </w:rPr>
-        <w:t xml:space="preserve">otsugyō (Newspaper </w:t>
-      </w:r>
-      <w:r>
-        <w:rPr>
-          <w:rFonts w:eastAsia="Baskerville" w:ascii="Baskerville" w:hAnsi="Baskerville"/>
-          <w:color w:val="000000"/>
-          <w:sz w:val="22"/>
-          <w:szCs w:val="22"/>
-        </w:rPr>
-        <w:t>r</w:t>
-      </w:r>
-      <w:r>
-        <w:rPr>
-          <w:rFonts w:eastAsia="Baskerville" w:ascii="Baskerville" w:hAnsi="Baskerville"/>
-          <w:color w:val="000000"/>
-          <w:sz w:val="22"/>
-          <w:szCs w:val="22"/>
-        </w:rPr>
-        <w:t>eporter: Graduation)</w:t>
+        <w:t>Furukawa, T. (1999). ‘Shimbun kisha’ sotsugyō (Newspaper reporter: Graduation)</w:t>
       </w:r>
       <w:r>
         <w:rPr>
@@ -2415,29 +2163,7 @@
           <w:sz w:val="22"/>
           <w:szCs w:val="22"/>
         </w:rPr>
-        <w:t xml:space="preserve">Political corruption: </w:t>
-      </w:r>
-      <w:r>
-        <w:rPr>
-          <w:rFonts w:eastAsia="Baskerville" w:ascii="Baskerville" w:hAnsi="Baskerville"/>
-          <w:i/>
-          <w:iCs/>
-          <w:color w:val="000000"/>
-          <w:sz w:val="22"/>
-          <w:szCs w:val="22"/>
-        </w:rPr>
-        <w:t>C</w:t>
-      </w:r>
-      <w:r>
-        <w:rPr>
-          <w:rFonts w:eastAsia="Baskerville" w:ascii="Baskerville" w:hAnsi="Baskerville"/>
-          <w:i/>
-          <w:iCs/>
-          <w:color w:val="000000"/>
-          <w:sz w:val="22"/>
-          <w:szCs w:val="22"/>
-        </w:rPr>
-        <w:t>oncepts and contexts.</w:t>
+        <w:t>Political corruption: Concepts and contexts.</w:t>
       </w:r>
       <w:r>
         <w:rPr>
@@ -2493,51 +2219,7 @@
           <w:sz w:val="22"/>
           <w:szCs w:val="22"/>
         </w:rPr>
-        <w:t xml:space="preserve">Japanese </w:t>
-      </w:r>
-      <w:r>
-        <w:rPr>
-          <w:rFonts w:eastAsia="Baskerville" w:ascii="Baskerville" w:hAnsi="Baskerville"/>
-          <w:i/>
-          <w:iCs/>
-          <w:color w:val="000000"/>
-          <w:sz w:val="22"/>
-          <w:szCs w:val="22"/>
-        </w:rPr>
-        <w:t>j</w:t>
-      </w:r>
-      <w:r>
-        <w:rPr>
-          <w:rFonts w:eastAsia="Baskerville" w:ascii="Baskerville" w:hAnsi="Baskerville"/>
-          <w:i/>
-          <w:iCs/>
-          <w:color w:val="000000"/>
-          <w:sz w:val="22"/>
-          <w:szCs w:val="22"/>
-        </w:rPr>
-        <w:t xml:space="preserve">ournalists and their </w:t>
-      </w:r>
-      <w:r>
-        <w:rPr>
-          <w:rFonts w:eastAsia="Baskerville" w:ascii="Baskerville" w:hAnsi="Baskerville"/>
-          <w:i/>
-          <w:iCs/>
-          <w:color w:val="000000"/>
-          <w:sz w:val="22"/>
-          <w:szCs w:val="22"/>
-        </w:rPr>
-        <w:t>w</w:t>
-      </w:r>
-      <w:r>
-        <w:rPr>
-          <w:rFonts w:eastAsia="Baskerville" w:ascii="Baskerville" w:hAnsi="Baskerville"/>
-          <w:i/>
-          <w:iCs/>
-          <w:color w:val="000000"/>
-          <w:sz w:val="22"/>
-          <w:szCs w:val="22"/>
-        </w:rPr>
-        <w:t>orld</w:t>
+        <w:t>Japanese journalists and their world</w:t>
       </w:r>
       <w:r>
         <w:rPr>
@@ -3001,51 +2683,7 @@
           <w:sz w:val="22"/>
           <w:szCs w:val="22"/>
         </w:rPr>
-        <w:t xml:space="preserve">Yajiuma </w:t>
-      </w:r>
-      <w:r>
-        <w:rPr>
-          <w:rFonts w:eastAsia="Baskerville" w:ascii="Baskerville" w:hAnsi="Baskerville"/>
-          <w:i/>
-          <w:iCs/>
-          <w:color w:val="000000"/>
-          <w:sz w:val="22"/>
-          <w:szCs w:val="22"/>
-        </w:rPr>
-        <w:t>m</w:t>
-      </w:r>
-      <w:r>
-        <w:rPr>
-          <w:rFonts w:eastAsia="Baskerville" w:ascii="Baskerville" w:hAnsi="Baskerville"/>
-          <w:i/>
-          <w:iCs/>
-          <w:color w:val="000000"/>
-          <w:sz w:val="22"/>
-          <w:szCs w:val="22"/>
-        </w:rPr>
-        <w:t xml:space="preserve">asukomi </w:t>
-      </w:r>
-      <w:r>
-        <w:rPr>
-          <w:rFonts w:eastAsia="Baskerville" w:ascii="Baskerville" w:hAnsi="Baskerville"/>
-          <w:i/>
-          <w:iCs/>
-          <w:color w:val="000000"/>
-          <w:sz w:val="22"/>
-          <w:szCs w:val="22"/>
-        </w:rPr>
-        <w:t>k</w:t>
-      </w:r>
-      <w:r>
-        <w:rPr>
-          <w:rFonts w:eastAsia="Baskerville" w:ascii="Baskerville" w:hAnsi="Baskerville"/>
-          <w:i/>
-          <w:iCs/>
-          <w:color w:val="000000"/>
-          <w:sz w:val="22"/>
-          <w:szCs w:val="22"/>
-        </w:rPr>
-        <w:t>ōza. Hōsō, Rajio-hen</w:t>
+        <w:t>Yajiuma masukomi kōza. Hōsō, Rajio-hen</w:t>
       </w:r>
       <w:r>
         <w:rPr>
@@ -3137,73 +2775,7 @@
           <w:sz w:val="22"/>
           <w:szCs w:val="22"/>
         </w:rPr>
-        <w:t xml:space="preserve">Munitions of the </w:t>
-      </w:r>
-      <w:r>
-        <w:rPr>
-          <w:rFonts w:eastAsia="Baskerville" w:ascii="Baskerville" w:hAnsi="Baskerville"/>
-          <w:i/>
-          <w:iCs/>
-          <w:color w:val="000000"/>
-          <w:sz w:val="22"/>
-          <w:szCs w:val="22"/>
-        </w:rPr>
-        <w:t>m</w:t>
-      </w:r>
-      <w:r>
-        <w:rPr>
-          <w:rFonts w:eastAsia="Baskerville" w:ascii="Baskerville" w:hAnsi="Baskerville"/>
-          <w:i/>
-          <w:iCs/>
-          <w:color w:val="000000"/>
-          <w:sz w:val="22"/>
-          <w:szCs w:val="22"/>
-        </w:rPr>
-        <w:t xml:space="preserve">ind: A </w:t>
-      </w:r>
-      <w:r>
-        <w:rPr>
-          <w:rFonts w:eastAsia="Baskerville" w:ascii="Baskerville" w:hAnsi="Baskerville"/>
-          <w:i/>
-          <w:iCs/>
-          <w:color w:val="000000"/>
-          <w:sz w:val="22"/>
-          <w:szCs w:val="22"/>
-        </w:rPr>
-        <w:t>h</w:t>
-      </w:r>
-      <w:r>
-        <w:rPr>
-          <w:rFonts w:eastAsia="Baskerville" w:ascii="Baskerville" w:hAnsi="Baskerville"/>
-          <w:i/>
-          <w:iCs/>
-          <w:color w:val="000000"/>
-          <w:sz w:val="22"/>
-          <w:szCs w:val="22"/>
-        </w:rPr>
-        <w:t xml:space="preserve">istory of </w:t>
-      </w:r>
-      <w:r>
-        <w:rPr>
-          <w:rFonts w:eastAsia="Baskerville" w:ascii="Baskerville" w:hAnsi="Baskerville"/>
-          <w:i/>
-          <w:iCs/>
-          <w:color w:val="000000"/>
-          <w:sz w:val="22"/>
-          <w:szCs w:val="22"/>
-        </w:rPr>
-        <w:t>p</w:t>
-      </w:r>
-      <w:r>
-        <w:rPr>
-          <w:rFonts w:eastAsia="Baskerville" w:ascii="Baskerville" w:hAnsi="Baskerville"/>
-          <w:i/>
-          <w:iCs/>
-          <w:color w:val="000000"/>
-          <w:sz w:val="22"/>
-          <w:szCs w:val="22"/>
-        </w:rPr>
-        <w:t>ropaganda</w:t>
+        <w:t>Munitions of the mind: A history of propaganda</w:t>
       </w:r>
       <w:r>
         <w:rPr>
@@ -3259,29 +2831,7 @@
           <w:sz w:val="22"/>
           <w:szCs w:val="22"/>
         </w:rPr>
-        <w:t xml:space="preserve">Grammar of the </w:t>
-      </w:r>
-      <w:r>
-        <w:rPr>
-          <w:rFonts w:eastAsia="Baskerville" w:ascii="Baskerville" w:hAnsi="Baskerville"/>
-          <w:i/>
-          <w:iCs/>
-          <w:color w:val="000000"/>
-          <w:sz w:val="22"/>
-          <w:szCs w:val="22"/>
-        </w:rPr>
-        <w:t>s</w:t>
-      </w:r>
-      <w:r>
-        <w:rPr>
-          <w:rFonts w:eastAsia="Baskerville" w:ascii="Baskerville" w:hAnsi="Baskerville"/>
-          <w:i/>
-          <w:iCs/>
-          <w:color w:val="000000"/>
-          <w:sz w:val="22"/>
-          <w:szCs w:val="22"/>
-        </w:rPr>
-        <w:t>hot</w:t>
+        <w:t>Grammar of the shot</w:t>
       </w:r>
       <w:r>
         <w:rPr>
@@ -3416,13 +2966,13 @@
       </w:r>
     </w:p>
     <w:sectPr>
-      <w:footerReference w:type="default" r:id="rId3"/>
+      <w:footerReference w:type="default" r:id="rId4"/>
       <w:footnotePr>
         <w:numFmt w:val="decimal"/>
       </w:footnotePr>
       <w:type w:val="nextPage"/>
       <w:pgSz w:w="11906" w:h="16838"/>
-      <w:pgMar w:left="1136" w:right="1136" w:header="0" w:top="1136" w:footer="1136" w:bottom="1695" w:gutter="0"/>
+      <w:pgMar w:left="1136" w:right="1136" w:gutter="0" w:header="0" w:top="1136" w:footer="1136" w:bottom="1695"/>
       <w:pgNumType w:fmt="decimal"/>
       <w:formProt w:val="false"/>
       <w:textDirection w:val="lrTb"/>
@@ -3946,7 +3496,8 @@
     <w:qFormat/>
     <w:pPr>
       <w:widowControl w:val="false"/>
-      <w:overflowPunct w:val="true"/>
+      <w:suppressAutoHyphens w:val="true"/>
+      <w:overflowPunct w:val="false"/>
       <w:bidi w:val="0"/>
       <w:spacing w:before="0" w:after="0"/>
       <w:jc w:val="left"/>

</xml_diff>